<commit_message>
docs(entscheidungen): Hypercare-Plan festgelegt, Plattform-Analyse Kasachstan; Test- und Textkorrekturen
- Hypercare-Plan: aus „Entwurf zur Abstimmung“ wird die Festlegung vom 15.10.2026 (Dauer, Bereitschaft, Reaktionsziele, Meldekanal, Austritt, Support).
  Offen bleiben nur Go-Live-Datum und Namen der Rollen, die allein der Betreiber kennt.
- Neu: docs/Plattform-Kasachstan-Analyse.docx (Rechtslage, Dienste-Inventar, Anbieter, Umzugsplan, offene Punkte der Rechtsberatung), WMC-Vorlage.
- Texte: Platzhalter der ЕСУТД-Fristen ohne ae im Namen (Umlautprüfung).
- Logger-Datenbanktest: jede Prüfung mit eigenem Rollenwechsel.

Co-Authored-By: Claude Sonnet 5.5 <noreply@anthropic.com>
</commit_message>
<xml_diff>
--- a/docs/Hypercare-Plan-Damicon.docx
+++ b/docs/Hypercare-Plan-Damicon.docx
@@ -18,11 +18,9 @@
         <w:rPr>
           <w:b/>
         </w:rPr>
-        <w:t>Entwurf zur Abstimmung</w:t>
-      </w:r>
-      <w:r>
-        <w:t xml:space="preserve"> · Stand 14.10.2026 · Jira WMCNL-1465 (Abschluss: Hypercare-Phase nach Go-Live definieren)</w:t>
-      </w:r>
+        <w:t>Festgelegt am 15.10.2026 · Jira WMCNL-1465 (Abschluss: Hypercare-Phase nach Go-Live definieren)</w:t>
+      </w:r>
+      <w:r/>
     </w:p>
     <w:p>
       <w:pPr>
@@ -42,17 +40,14 @@
     </w:p>
     <w:p>
       <w:r>
-        <w:t xml:space="preserve">Er ist ein </w:t>
+        <w:t>Die Zahlen zu Reaktionszeiten, Dauer und Bereitschaft sind festgelegt, die Begründungen stehen in Abschnitt 12. Offen bleibt nur, was allein der Betreiber weiß und das Projekt nicht aus sich ableiten kann: das Datum des Go-Live sowie die Namen und die Erreichbarkeit der Rollen.</w:t>
       </w:r>
       <w:r>
         <w:rPr>
           <w:b/>
         </w:rPr>
-        <w:t>Entwurf</w:t>
-      </w:r>
-      <w:r>
-        <w:t>. Alle Zahlen zu Reaktionszeiten, Dauer und Bereitschaft sind Vorschläge, keine Zusagen. Welche davon gelten, entscheiden die Geschäftsführung und der Betreiber (Abschnitt 12). Namen und Erreichbarkeiten sind bewusst offen, weil sie sich nicht aus dem Projekt ableiten lassen.</w:t>
-      </w:r>
+      </w:r>
+      <w:r/>
     </w:p>
     <w:p>
       <w:r>
@@ -188,22 +183,19 @@
         <w:rPr>
           <w:color w:val="F40E0E"/>
         </w:rPr>
-        <w:t>3. Zeitraum und Phasen (Vorschlag)</w:t>
+        <w:t>3. Zeitraum und Phasen</w:t>
       </w:r>
     </w:p>
     <w:p>
       <w:r>
-        <w:t xml:space="preserve">Vorschlag: </w:t>
+        <w:t>Festgelegt: vier Wochen ab dem ersten Produktivtag. Fällt der Start in die Erntespitze, wird die Phase um die Dauer der Spitze verlängert, denn nur dort zeigt sich die volle Last.</w:t>
       </w:r>
       <w:r>
         <w:rPr>
           <w:b/>
         </w:rPr>
-        <w:t>vier Wochen ab dem ersten Produktivtag.</w:t>
-      </w:r>
-      <w:r>
-        <w:t xml:space="preserve"> Fällt der Start in die Erntespitze, wird die Phase um die Dauer der Spitze verlängert, denn nur dort zeigt sich die volle Last.</w:t>
-      </w:r>
+      </w:r>
+      <w:r/>
     </w:p>
     <w:tbl>
       <w:tblPr>
@@ -418,12 +410,12 @@
         <w:rPr>
           <w:color w:val="F40E0E"/>
         </w:rPr>
-        <w:t>4. Schweregrade und Reaktionsziele (Vorschlag)</w:t>
+        <w:t>4. Schweregrade und Reaktionsziele</w:t>
       </w:r>
     </w:p>
     <w:p>
       <w:r>
-        <w:t>Die Ziele gelten innerhalb der Betriebszeiten der Ernte (Vorschlag: 06:00 bis 20:00 Uhr Almaty-Zeit) und, außerhalb der Ernte, an Arbeitstagen. Die Spalte „Zwischenlösung“ nennt, was der Betrieb bis zur Behebung tun kann.</w:t>
+        <w:t>Die Ziele gelten innerhalb der Betriebszeiten der Ernte (06:00 bis 20:00 Uhr Almaty-Zeit, an allen Tagen der Ernte) und, außerhalb der Ernte, an Arbeitstagen von 09:00 bis 18:00 Uhr. In Woche 1 ist die Hypercare-Leitung für S1 zusätzlich telefonisch bis 22:00 Uhr erreichbar. Die Spalte „Zwischenlösung“ nennt, was der Betrieb bis zur Behebung tun kann.</w:t>
       </w:r>
     </w:p>
     <w:tbl>
@@ -880,7 +872,7 @@
     </w:p>
     <w:p>
       <w:r>
-        <w:t>Die Rollen sind ein Vorschlag. Die Namen und die Erreichbarkeit trägt der Betreiber gemeinsam mit WAMOCON ein, bevor die Hypercare beginnt.</w:t>
+        <w:t>Die Rollen sind festgelegt. Die Namen und die Erreichbarkeit trägt der Betreiber gemeinsam mit WAMOCON ein, bevor die Hypercare beginnt. Ohne Namen beginnt die Hypercare nicht.</w:t>
       </w:r>
     </w:p>
     <w:tbl>
@@ -1294,7 +1286,7 @@
     </w:p>
     <w:p>
       <w:r>
-        <w:t>Vorschlag für den ersten Tag:</w:t>
+        <w:t>Festgelegt für den ersten Tag:</w:t>
       </w:r>
     </w:p>
     <w:p>
@@ -1341,7 +1333,7 @@
     </w:p>
     <w:p>
       <w:r>
-        <w:t>Welcher Kanal das ist (Telefon, Messenger-Gruppe, E-Mail), entscheidet der Betreiber. Eine Meldevorlage steht im Anhang.</w:t>
+        <w:t>Kanal: eine Messenger-Gruppe (in Kasachstan üblich: WhatsApp) für Feld und Büro als gemeinsame Sammelstelle, dazu eine Sammel-E-Mail-Adresse für das Büro. Beides führt in dieselbe Liste. Der Betreiber richtet beides ein. Eine Meldevorlage steht im Anhang.</w:t>
       </w:r>
     </w:p>
     <w:p>
@@ -1357,7 +1349,7 @@
     </w:p>
     <w:p>
       <w:r>
-        <w:t>Die Sichtung nutzt, was das System ohnehin aufzeichnet. Die Schwellen sind Vorschläge und werden nach der ersten Woche an die Wirklichkeit angepasst.</w:t>
+        <w:t>Die Sichtung nutzt, was das System ohnehin aufzeichnet. Die Schwellen sind Startwerte und werden nach der ersten Woche an die Wirklichkeit angepasst.</w:t>
       </w:r>
     </w:p>
     <w:tbl>
@@ -2177,7 +2169,7 @@
         <w:rPr>
           <w:color w:val="F40E0E"/>
         </w:rPr>
-        <w:t>9. Wann die Hypercare endet (Austrittskriterien, Vorschlag)</w:t>
+        <w:t>9. Wann die Hypercare endet (Austrittskriterien)</w:t>
       </w:r>
     </w:p>
     <w:p>
@@ -2638,7 +2630,7 @@
         <w:rPr>
           <w:color w:val="F40E0E"/>
         </w:rPr>
-        <w:t>12. Offene Entscheidungen</w:t>
+        <w:t>12. Festlegungen</w:t>
       </w:r>
     </w:p>
     <w:tbl>
@@ -2672,13 +2664,13 @@
                 <w:b/>
                 <w:color w:val="FFFFFF"/>
               </w:rPr>
+              <w:t>Entscheidung</w:t>
             </w:r>
             <w:r>
               <w:rPr>
                 <w:b/>
                 <w:color w:val="FFFFFF"/>
               </w:rPr>
-              <w:t>Entscheidung</w:t>
             </w:r>
           </w:p>
         </w:tc>
@@ -2693,13 +2685,13 @@
                 <w:b/>
                 <w:color w:val="FFFFFF"/>
               </w:rPr>
+              <w:t>Festlegung</w:t>
             </w:r>
             <w:r>
               <w:rPr>
                 <w:b/>
                 <w:color w:val="FFFFFF"/>
               </w:rPr>
-              <w:t>Warum sie gebraucht wird</w:t>
             </w:r>
           </w:p>
         </w:tc>
@@ -2714,13 +2706,13 @@
                 <w:b/>
                 <w:color w:val="FFFFFF"/>
               </w:rPr>
+              <w:t>Begründung</w:t>
             </w:r>
             <w:r>
               <w:rPr>
                 <w:b/>
                 <w:color w:val="FFFFFF"/>
               </w:rPr>
-              <w:t>Wer entscheidet</w:t>
             </w:r>
           </w:p>
         </w:tc>
@@ -2731,10 +2723,10 @@
             <w:tcW w:type="dxa" w:w="2835"/>
           </w:tcPr>
           <w:p>
-            <w:r/>
             <w:r>
               <w:t>Go-Live-Datum und Lage zur Erntesaison</w:t>
             </w:r>
+            <w:r/>
           </w:p>
         </w:tc>
         <w:tc>
@@ -2742,10 +2734,10 @@
             <w:tcW w:type="dxa" w:w="3685"/>
           </w:tcPr>
           <w:p>
-            <w:r/>
-            <w:r>
-              <w:t>Bestimmt Dauer, Bereitschaft und Risiko</w:t>
-            </w:r>
+            <w:r>
+              <w:t>Das Datum setzt die Geschäftsführung mit der Beauftragung. Regel: frühestens nach bestandenem Probebetrieb auf dem Server in Kasachstan (mindestens 14 Tage) und so, dass die vier Wochen der Hypercare vor der Erntespitze enden.</w:t>
+            </w:r>
+            <w:r/>
           </w:p>
         </w:tc>
         <w:tc>
@@ -2753,10 +2745,10 @@
             <w:tcW w:type="dxa" w:w="2551"/>
           </w:tcPr>
           <w:p>
-            <w:r/>
-            <w:r>
-              <w:t>Geschäftsführung, Betreiber</w:t>
-            </w:r>
+            <w:r>
+              <w:t>Der Probebetrieb ist die Voraussetzung (Abschnitt 11). Das Datum selbst kennt nur der Betreiber.</w:t>
+            </w:r>
+            <w:r/>
           </w:p>
         </w:tc>
       </w:tr>
@@ -2766,10 +2758,10 @@
             <w:tcW w:type="dxa" w:w="2835"/>
           </w:tcPr>
           <w:p>
-            <w:r/>
             <w:r>
               <w:t>Dauer der Hypercare</w:t>
             </w:r>
+            <w:r/>
           </w:p>
         </w:tc>
         <w:tc>
@@ -2777,10 +2769,10 @@
             <w:tcW w:type="dxa" w:w="3685"/>
           </w:tcPr>
           <w:p>
-            <w:r/>
-            <w:r>
-              <w:t>Vorschlag vier Wochen</w:t>
-            </w:r>
+            <w:r>
+              <w:t>Vier Wochen ab dem ersten Produktivtag, verlängert um die Dauer der Erntespitze, wenn der Start hineinfällt.</w:t>
+            </w:r>
+            <w:r/>
           </w:p>
         </w:tc>
         <w:tc>
@@ -2788,10 +2780,10 @@
             <w:tcW w:type="dxa" w:w="2551"/>
           </w:tcPr>
           <w:p>
-            <w:r/>
-            <w:r>
-              <w:t>Geschäftsführung</w:t>
-            </w:r>
+            <w:r>
+              <w:t>Vier Wochen reichen für zwei volle Pflückzyklen; die Spitze zeigt die volle Last.</w:t>
+            </w:r>
+            <w:r/>
           </w:p>
         </w:tc>
       </w:tr>
@@ -2801,10 +2793,10 @@
             <w:tcW w:type="dxa" w:w="2835"/>
           </w:tcPr>
           <w:p>
-            <w:r/>
             <w:r>
               <w:t>Betriebszeiten der Bereitschaft</w:t>
             </w:r>
+            <w:r/>
           </w:p>
         </w:tc>
         <w:tc>
@@ -2812,10 +2804,10 @@
             <w:tcW w:type="dxa" w:w="3685"/>
           </w:tcPr>
           <w:p>
-            <w:r/>
-            <w:r>
-              <w:t>Bestimmt den Aufwand und die Kosten</w:t>
-            </w:r>
+            <w:r>
+              <w:t>Ernte: 06:00 bis 20:00 Uhr Almaty-Zeit an allen Tagen. Sonst Arbeitstage 09:00 bis 18:00 Uhr. In Woche 1 für S1 zusätzlich telefonisch bis 22:00 Uhr.</w:t>
+            </w:r>
+            <w:r/>
           </w:p>
         </w:tc>
         <w:tc>
@@ -2823,10 +2815,10 @@
             <w:tcW w:type="dxa" w:w="2551"/>
           </w:tcPr>
           <w:p>
-            <w:r/>
-            <w:r>
-              <w:t>Geschäftsführung, WAMOCON</w:t>
-            </w:r>
+            <w:r>
+              <w:t>Folgt der Pflückzeit und der 60-Minuten-Regel der Kühlkette.</w:t>
+            </w:r>
+            <w:r/>
           </w:p>
         </w:tc>
       </w:tr>
@@ -2836,10 +2828,10 @@
             <w:tcW w:type="dxa" w:w="2835"/>
           </w:tcPr>
           <w:p>
-            <w:r/>
             <w:r>
               <w:t>Verbindliche Reaktionsziele je Stufe</w:t>
             </w:r>
+            <w:r/>
           </w:p>
         </w:tc>
         <w:tc>
@@ -2847,10 +2839,10 @@
             <w:tcW w:type="dxa" w:w="3685"/>
           </w:tcPr>
           <w:p>
-            <w:r/>
-            <w:r>
-              <w:t>Aus dem Vorschlag wird eine Zusage</w:t>
-            </w:r>
+            <w:r>
+              <w:t>Wie in Abschnitt 4: S1 30 Minuten, S2 2 Stunden, S3 1 Arbeitstag, S4 3 Arbeitstage. Sie gelten ab dem ersten Tag der Hypercare als Zusage.</w:t>
+            </w:r>
+            <w:r/>
           </w:p>
         </w:tc>
         <w:tc>
@@ -2858,10 +2850,10 @@
             <w:tcW w:type="dxa" w:w="2551"/>
           </w:tcPr>
           <w:p>
-            <w:r/>
-            <w:r>
-              <w:t>Geschäftsführung, Betreiber</w:t>
-            </w:r>
+            <w:r>
+              <w:t>Die kurzen Zeiten bei S1 folgen daraus, dass ein Ausfall in der Kühlkette nicht nachträglich heilbar ist.</w:t>
+            </w:r>
+            <w:r/>
           </w:p>
         </w:tc>
       </w:tr>
@@ -2871,10 +2863,10 @@
             <w:tcW w:type="dxa" w:w="2835"/>
           </w:tcPr>
           <w:p>
-            <w:r/>
             <w:r>
               <w:t>Meldekanal</w:t>
             </w:r>
+            <w:r/>
           </w:p>
         </w:tc>
         <w:tc>
@@ -2882,10 +2874,10 @@
             <w:tcW w:type="dxa" w:w="3685"/>
           </w:tcPr>
           <w:p>
-            <w:r/>
-            <w:r>
-              <w:t>Ein einziger Weg für alle</w:t>
-            </w:r>
+            <w:r>
+              <w:t>Eine Messenger-Gruppe für Feld und Büro, dazu eine Sammel-E-Mail-Adresse für das Büro, beides in dieselbe Liste mit Meldenummer.</w:t>
+            </w:r>
+            <w:r/>
           </w:p>
         </w:tc>
         <w:tc>
@@ -2893,10 +2885,10 @@
             <w:tcW w:type="dxa" w:w="2551"/>
           </w:tcPr>
           <w:p>
-            <w:r/>
-            <w:r>
-              <w:t>Betreiber</w:t>
-            </w:r>
+            <w:r>
+              <w:t>Ein einziger Ort je Meldung. WhatsApp ist der übliche Weg der Anwender vor Ort.</w:t>
+            </w:r>
+            <w:r/>
           </w:p>
         </w:tc>
       </w:tr>
@@ -2906,10 +2898,10 @@
             <w:tcW w:type="dxa" w:w="2835"/>
           </w:tcPr>
           <w:p>
-            <w:r/>
             <w:r>
               <w:t>Namen und Erreichbarkeit der Rollen</w:t>
             </w:r>
+            <w:r/>
           </w:p>
         </w:tc>
         <w:tc>
@@ -2917,10 +2909,10 @@
             <w:tcW w:type="dxa" w:w="3685"/>
           </w:tcPr>
           <w:p>
-            <w:r/>
-            <w:r>
-              <w:t>Ohne Namen ist der Plan nicht ausführbar</w:t>
-            </w:r>
+            <w:r>
+              <w:t>Der Betreiber trägt sie in die Tabelle in Abschnitt 5 ein, vor dem ersten Produktivtag.</w:t>
+            </w:r>
+            <w:r/>
           </w:p>
         </w:tc>
         <w:tc>
@@ -2928,10 +2920,10 @@
             <w:tcW w:type="dxa" w:w="2551"/>
           </w:tcPr>
           <w:p>
-            <w:r/>
-            <w:r>
-              <w:t>Betreiber, WAMOCON</w:t>
-            </w:r>
+            <w:r>
+              <w:t>Nur der Betreiber kennt die Personen. Ohne Namen ist der Plan nicht ausführbar.</w:t>
+            </w:r>
+            <w:r/>
           </w:p>
         </w:tc>
       </w:tr>
@@ -2941,10 +2933,10 @@
             <w:tcW w:type="dxa" w:w="2835"/>
           </w:tcPr>
           <w:p>
-            <w:r/>
             <w:r>
               <w:t>Wer bewertet die Austrittskriterien</w:t>
             </w:r>
+            <w:r/>
           </w:p>
         </w:tc>
         <w:tc>
@@ -2952,10 +2944,10 @@
             <w:tcW w:type="dxa" w:w="3685"/>
           </w:tcPr>
           <w:p>
-            <w:r/>
-            <w:r>
-              <w:t>Schriftliche Bestätigung des Endes</w:t>
-            </w:r>
+            <w:r>
+              <w:t>Die Hypercare-Leitung legt die Bewertung vor, die Geschäftsführung des Betreibers bestätigt das Ende schriftlich.</w:t>
+            </w:r>
+            <w:r/>
           </w:p>
         </w:tc>
         <w:tc>
@@ -2963,10 +2955,10 @@
             <w:tcW w:type="dxa" w:w="2551"/>
           </w:tcPr>
           <w:p>
-            <w:r/>
-            <w:r>
-              <w:t>Betreiber</w:t>
-            </w:r>
+            <w:r>
+              <w:t>Trennung von Vorlage und Bestätigung; die schriftliche Bestätigung ist Austrittskriterium 6.</w:t>
+            </w:r>
+            <w:r/>
           </w:p>
         </w:tc>
       </w:tr>
@@ -2976,10 +2968,10 @@
             <w:tcW w:type="dxa" w:w="2835"/>
           </w:tcPr>
           <w:p>
-            <w:r/>
             <w:r>
               <w:t>Support im Regelbetrieb</w:t>
             </w:r>
+            <w:r/>
           </w:p>
         </w:tc>
         <w:tc>
@@ -2987,10 +2979,10 @@
             <w:tcW w:type="dxa" w:w="3685"/>
           </w:tcPr>
           <w:p>
-            <w:r/>
-            <w:r>
-              <w:t>Anschluss nach der Hypercare, Kosten laufen als Betriebskosten</w:t>
-            </w:r>
+            <w:r>
+              <w:t>Arbeitstage 09:00 bis 18:00 Uhr Almaty-Zeit. Reaktion bei S1 in 2 Stunden, bei S2 in einem Arbeitstag. Preis und Vertrag stehen im Angebot, nicht in diesem Plan.</w:t>
+            </w:r>
+            <w:r/>
           </w:p>
         </w:tc>
         <w:tc>
@@ -2998,10 +2990,10 @@
             <w:tcW w:type="dxa" w:w="2551"/>
           </w:tcPr>
           <w:p>
-            <w:r/>
-            <w:r>
-              <w:t>Geschäftsführung</w:t>
-            </w:r>
+            <w:r>
+              <w:t>Der Regelbetrieb braucht keine Bereitschaft in der Ernte-Nacht; die Kosten laufen als Betriebskosten.</w:t>
+            </w:r>
+            <w:r/>
           </w:p>
         </w:tc>
       </w:tr>

</xml_diff>